<commit_message>
docs(submission): correct exhibitor affiliation
</commit_message>
<xml_diff>
--- a/output/docx/digital-delta-report.docx
+++ b/output/docx/digital-delta-report.docx
@@ -35,7 +35,7 @@
                 <w:color w:val="FFFFFF"/>
                 <w:sz w:val="20"/>
               </w:rPr>
-              <w:t>BANGLADESH INNOVATION FAIR 2026</w:t>
+              <w:t>BANGLADESH INNOVATION FAIR 2026  •  INNOVATION EXHIBITOR</w:t>
             </w:r>
           </w:p>
         </w:tc>
@@ -186,6 +186,49 @@
                 <w:sz w:val="18"/>
               </w:rPr>
               <w:t>Touhidul Alam Seyam</w:t>
+            </w:r>
+          </w:p>
+        </w:tc>
+      </w:tr>
+      <w:tr>
+        <w:tc>
+          <w:tcPr>
+            <w:tcW w:type="dxa" w:w="1800"/>
+            <w:shd w:fill="E8F4F5"/>
+            <w:tcMar>
+              <w:top w:w="70" w:type="dxa"/>
+              <w:start w:w="110" w:type="dxa"/>
+              <w:bottom w:w="70" w:type="dxa"/>
+              <w:end w:w="110" w:type="dxa"/>
+            </w:tcMar>
+          </w:tcPr>
+          <w:p>
+            <w:r>
+              <w:rPr>
+                <w:b/>
+                <w:color w:val="075D67"/>
+                <w:sz w:val="16"/>
+              </w:rPr>
+              <w:t>INSTITUTION</w:t>
+            </w:r>
+          </w:p>
+        </w:tc>
+        <w:tc>
+          <w:tcPr>
+            <w:tcW w:type="dxa" w:w="6984"/>
+            <w:tcMar>
+              <w:top w:w="70" w:type="dxa"/>
+              <w:start w:w="110" w:type="dxa"/>
+              <w:bottom w:w="70" w:type="dxa"/>
+              <w:end w:w="110" w:type="dxa"/>
+            </w:tcMar>
+          </w:tcPr>
+          <w:p>
+            <w:r>
+              <w:rPr>
+                <w:sz w:val="18"/>
+              </w:rPr>
+              <w:t>BGC Trust University Bangladesh</w:t>
             </w:r>
           </w:p>
         </w:tc>
@@ -2090,7 +2133,7 @@
         <w:pStyle w:val="ListBullet"/>
       </w:pPr>
       <w:r>
-        <w:t>organizer confirmation of participation, event date, pitch duration, and booth equipment.</w:t>
+        <w:t>organizer confirmation of Innovation Exhibitor acceptance, package and payment status, stall allocation, event date, any pitch duration, and booth equipment.</w:t>
       </w:r>
     </w:p>
     <w:p>
@@ -2141,7 +2184,7 @@
     </w:p>
     <w:p>
       <w:r>
-        <w:t>Touhidul Alam Seyam is the individual project lead and developer. The work covers product design, Android development, Go services, cryptography integration, routing and ML integration, the Next.js headquarters interface, testing, evidence capture, and the fair package. The public GitHub profile lists Agentic Institute as the current affiliation. No additional team member is recorded for this submission.</w:t>
+        <w:t>Touhidul Alam Seyam of BGC Trust University Bangladesh is the individual project lead and developer. The work covers product design, Android development, Go services, cryptography integration, routing and ML integration, the Next.js headquarters interface, testing, evidence capture, and the fair package. No additional team member is recorded for this exhibition.</w:t>
       </w:r>
     </w:p>
     <w:p>
@@ -2333,7 +2376,7 @@
         <w:pStyle w:val="ListBullet"/>
       </w:pPr>
       <w:r>
-        <w:t xml:space="preserve">Bangladesh Innovation Fair official application: </w:t>
+        <w:t xml:space="preserve">Bangladesh Innovation Fair Innovation Exhibitor registration: </w:t>
       </w:r>
       <w:hyperlink r:id="rId31">
         <w:r>
@@ -2341,7 +2384,7 @@
             <w:color w:val="087F8C"/>
             <w:u w:val="single"/>
           </w:rPr>
-          <w:t>https://www.innovationfairbd.org/innovator-application-form?type=innovator</w:t>
+          <w:t>https://www.innovationfairbd.org/innovator-application-form?type=Exhibitor</w:t>
         </w:r>
       </w:hyperlink>
     </w:p>

</xml_diff>